<commit_message>
User Guide (Ver 1.0): add four figures with captions
Four screenshots captured from the running app, embedded as inline
images with centered-italic "Figure N." captions (3 pt above the
caption, kept with their figure): the photo positioned on the grid
(section 6), the finished mosaic on its baseplate (7), Compare
side-by-side (9), and See-through (9). Studio's screenshots were
stripped and replaced.

Schema validates and the Word-COM pagination check is clean -- no
orphans, every heading keeps with its text, no autospacing, and figures
sized (3.3 in / 4.9 in) so none strands a near-empty page. Five pages.

Co-Authored-By: Claude Opus 4.8 <noreply@anthropic.com>
</commit_message>
<xml_diff>
--- a/Documents/User Guide (Ver 1.0).docx
+++ b/Documents/User Guide (Ver 1.0).docx
@@ -947,6 +947,63 @@
     </w:p>
     <w:p>
       <w:pPr>
+        <w:keepNext/>
+        <w:spacing w:before="120" w:after="0"/>
+        <w:jc w:val="center"/>
+      </w:pPr>
+      <w:r>
+        <w:drawing>
+          <wp:inline distT="0" distB="0" distL="0" distR="0">
+            <wp:extent cx="3017520" cy="2984464"/>
+            <wp:effectExtent l="0" t="0" r="0" b="0"/>
+            <wp:docPr id="1001" name="Figure1"/>
+            <wp:cNvGraphicFramePr>
+              <a:graphicFrameLocks xmlns:a="http://schemas.openxmlformats.org/drawingml/2006/main" noChangeAspect="1"/>
+            </wp:cNvGraphicFramePr>
+            <a:graphic xmlns:a="http://schemas.openxmlformats.org/drawingml/2006/main">
+              <a:graphicData uri="http://schemas.openxmlformats.org/drawingml/2006/picture">
+                <pic:pic xmlns:pic="http://schemas.openxmlformats.org/drawingml/2006/picture">
+                  <pic:nvPicPr>
+                    <pic:cNvPr id="1001" name="Figure1.png"/>
+                    <pic:cNvPicPr/>
+                  </pic:nvPicPr>
+                  <pic:blipFill>
+                    <a:blip r:embed="rIdFig1"/>
+                    <a:stretch>
+                      <a:fillRect/>
+                    </a:stretch>
+                  </pic:blipFill>
+                  <pic:spPr>
+                    <a:xfrm>
+                      <a:off x="0" y="0"/>
+                      <a:ext cx="3017520" cy="2984464"/>
+                    </a:xfrm>
+                    <a:prstGeom prst="rect">
+                      <a:avLst/>
+                    </a:prstGeom>
+                  </pic:spPr>
+                </pic:pic>
+              </a:graphicData>
+            </a:graphic>
+          </wp:inline>
+        </w:drawing>
+      </w:r>
+    </w:p>
+    <w:p>
+      <w:pPr>
+        <w:spacing w:before="60" w:after="120"/>
+        <w:jc w:val="center"/>
+      </w:pPr>
+      <w:r>
+        <w:rPr>
+          <w:i/>
+          <w:iCs/>
+        </w:rPr>
+        <w:t xml:space="preserve">Figure 1. A photo positioned under the grid — whatever falls inside the frame becomes the mosaic.</w:t>
+      </w:r>
+    </w:p>
+    <w:p>
+      <w:pPr>
         <w:pStyle w:val="Heading2"/>
         <w:keepNext/>
         <w:keepLines/>
@@ -1116,6 +1173,63 @@
     </w:p>
     <w:p>
       <w:pPr>
+        <w:keepNext/>
+        <w:spacing w:before="120" w:after="0"/>
+        <w:jc w:val="center"/>
+      </w:pPr>
+      <w:r>
+        <w:drawing>
+          <wp:inline distT="0" distB="0" distL="0" distR="0">
+            <wp:extent cx="3017520" cy="2984464"/>
+            <wp:effectExtent l="0" t="0" r="0" b="0"/>
+            <wp:docPr id="1002" name="Figure2"/>
+            <wp:cNvGraphicFramePr>
+              <a:graphicFrameLocks xmlns:a="http://schemas.openxmlformats.org/drawingml/2006/main" noChangeAspect="1"/>
+            </wp:cNvGraphicFramePr>
+            <a:graphic xmlns:a="http://schemas.openxmlformats.org/drawingml/2006/main">
+              <a:graphicData uri="http://schemas.openxmlformats.org/drawingml/2006/picture">
+                <pic:pic xmlns:pic="http://schemas.openxmlformats.org/drawingml/2006/picture">
+                  <pic:nvPicPr>
+                    <pic:cNvPr id="1002" name="Figure2.png"/>
+                    <pic:cNvPicPr/>
+                  </pic:nvPicPr>
+                  <pic:blipFill>
+                    <a:blip r:embed="rIdFig2"/>
+                    <a:stretch>
+                      <a:fillRect/>
+                    </a:stretch>
+                  </pic:blipFill>
+                  <pic:spPr>
+                    <a:xfrm>
+                      <a:off x="0" y="0"/>
+                      <a:ext cx="3017520" cy="2984464"/>
+                    </a:xfrm>
+                    <a:prstGeom prst="rect">
+                      <a:avLst/>
+                    </a:prstGeom>
+                  </pic:spPr>
+                </pic:pic>
+              </a:graphicData>
+            </a:graphic>
+          </wp:inline>
+        </w:drawing>
+      </w:r>
+    </w:p>
+    <w:p>
+      <w:pPr>
+        <w:spacing w:before="60" w:after="120"/>
+        <w:jc w:val="center"/>
+      </w:pPr>
+      <w:r>
+        <w:rPr>
+          <w:i/>
+          <w:iCs/>
+        </w:rPr>
+        <w:t xml:space="preserve">Figure 2. The finished mosaic on its baseplate.</w:t>
+      </w:r>
+    </w:p>
+    <w:p>
+      <w:pPr>
         <w:pStyle w:val="Heading2"/>
         <w:keepNext/>
         <w:keepLines/>
@@ -1351,6 +1465,120 @@
       </w:pPr>
       <w:r>
         <w:t xml:space="preserve">Click the workspace to leave a result view and go back to arranging.</w:t>
+      </w:r>
+    </w:p>
+    <w:p>
+      <w:pPr>
+        <w:keepNext/>
+        <w:spacing w:before="120" w:after="0"/>
+        <w:jc w:val="center"/>
+      </w:pPr>
+      <w:r>
+        <w:drawing>
+          <wp:inline distT="0" distB="0" distL="0" distR="0">
+            <wp:extent cx="4480560" cy="2305849"/>
+            <wp:effectExtent l="0" t="0" r="0" b="0"/>
+            <wp:docPr id="1003" name="Figure3"/>
+            <wp:cNvGraphicFramePr>
+              <a:graphicFrameLocks xmlns:a="http://schemas.openxmlformats.org/drawingml/2006/main" noChangeAspect="1"/>
+            </wp:cNvGraphicFramePr>
+            <a:graphic xmlns:a="http://schemas.openxmlformats.org/drawingml/2006/main">
+              <a:graphicData uri="http://schemas.openxmlformats.org/drawingml/2006/picture">
+                <pic:pic xmlns:pic="http://schemas.openxmlformats.org/drawingml/2006/picture">
+                  <pic:nvPicPr>
+                    <pic:cNvPr id="1003" name="Figure3.png"/>
+                    <pic:cNvPicPr/>
+                  </pic:nvPicPr>
+                  <pic:blipFill>
+                    <a:blip r:embed="rIdFig3"/>
+                    <a:stretch>
+                      <a:fillRect/>
+                    </a:stretch>
+                  </pic:blipFill>
+                  <pic:spPr>
+                    <a:xfrm>
+                      <a:off x="0" y="0"/>
+                      <a:ext cx="4480560" cy="2305849"/>
+                    </a:xfrm>
+                    <a:prstGeom prst="rect">
+                      <a:avLst/>
+                    </a:prstGeom>
+                  </pic:spPr>
+                </pic:pic>
+              </a:graphicData>
+            </a:graphic>
+          </wp:inline>
+        </w:drawing>
+      </w:r>
+    </w:p>
+    <w:p>
+      <w:pPr>
+        <w:spacing w:before="60" w:after="120"/>
+        <w:jc w:val="center"/>
+      </w:pPr>
+      <w:r>
+        <w:rPr>
+          <w:i/>
+          <w:iCs/>
+        </w:rPr>
+        <w:t xml:space="preserve">Figure 3. Compare places the photo beside the mosaic.</w:t>
+      </w:r>
+    </w:p>
+    <w:p>
+      <w:pPr>
+        <w:keepNext/>
+        <w:spacing w:before="120" w:after="0"/>
+        <w:jc w:val="center"/>
+      </w:pPr>
+      <w:r>
+        <w:drawing>
+          <wp:inline distT="0" distB="0" distL="0" distR="0">
+            <wp:extent cx="3017520" cy="2984464"/>
+            <wp:effectExtent l="0" t="0" r="0" b="0"/>
+            <wp:docPr id="1004" name="Figure4"/>
+            <wp:cNvGraphicFramePr>
+              <a:graphicFrameLocks xmlns:a="http://schemas.openxmlformats.org/drawingml/2006/main" noChangeAspect="1"/>
+            </wp:cNvGraphicFramePr>
+            <a:graphic xmlns:a="http://schemas.openxmlformats.org/drawingml/2006/main">
+              <a:graphicData uri="http://schemas.openxmlformats.org/drawingml/2006/picture">
+                <pic:pic xmlns:pic="http://schemas.openxmlformats.org/drawingml/2006/picture">
+                  <pic:nvPicPr>
+                    <pic:cNvPr id="1004" name="Figure4.png"/>
+                    <pic:cNvPicPr/>
+                  </pic:nvPicPr>
+                  <pic:blipFill>
+                    <a:blip r:embed="rIdFig4"/>
+                    <a:stretch>
+                      <a:fillRect/>
+                    </a:stretch>
+                  </pic:blipFill>
+                  <pic:spPr>
+                    <a:xfrm>
+                      <a:off x="0" y="0"/>
+                      <a:ext cx="3017520" cy="2984464"/>
+                    </a:xfrm>
+                    <a:prstGeom prst="rect">
+                      <a:avLst/>
+                    </a:prstGeom>
+                  </pic:spPr>
+                </pic:pic>
+              </a:graphicData>
+            </a:graphic>
+          </wp:inline>
+        </w:drawing>
+      </w:r>
+    </w:p>
+    <w:p>
+      <w:pPr>
+        <w:spacing w:before="60" w:after="120"/>
+        <w:jc w:val="center"/>
+      </w:pPr>
+      <w:r>
+        <w:rPr>
+          <w:i/>
+          <w:iCs/>
+        </w:rPr>
+        <w:t xml:space="preserve">Figure 4. See-through makes the tiles translucent so the photo shows through.</w:t>
       </w:r>
     </w:p>
     <w:p>

</xml_diff>